<commit_message>
add images throughout the book
</commit_message>
<xml_diff>
--- a/livro-trajetoria-politica-brasileira.docx
+++ b/livro-trajetoria-politica-brasileira.docx
@@ -166,6 +166,60 @@
     </w:p>
     <w:p>
       <w:pPr>
+        <w:spacing w:before="200" w:after="40"/>
+        <w:jc w:val="center"/>
+      </w:pPr>
+      <w:r>
+        <w:drawing>
+          <wp:inline xmlns:a="http://schemas.openxmlformats.org/drawingml/2006/main" xmlns:pic="http://schemas.openxmlformats.org/drawingml/2006/picture">
+            <wp:extent cx="4754880" cy="3323657"/>
+            <wp:docPr id="1" name="Picture 1"/>
+            <wp:cNvGraphicFramePr>
+              <a:graphicFrameLocks noChangeAspect="1"/>
+            </wp:cNvGraphicFramePr>
+            <a:graphic>
+              <a:graphicData uri="http://schemas.openxmlformats.org/drawingml/2006/picture">
+                <pic:pic>
+                  <pic:nvPicPr>
+                    <pic:cNvPr id="0" name="01.jpg"/>
+                    <pic:cNvPicPr/>
+                  </pic:nvPicPr>
+                  <pic:blipFill>
+                    <a:blip r:embed="rId10"/>
+                    <a:stretch>
+                      <a:fillRect/>
+                    </a:stretch>
+                  </pic:blipFill>
+                  <pic:spPr>
+                    <a:xfrm>
+                      <a:off x="0" y="0"/>
+                      <a:ext cx="4754880" cy="3323657"/>
+                    </a:xfrm>
+                    <a:prstGeom prst="rect"/>
+                  </pic:spPr>
+                </pic:pic>
+              </a:graphicData>
+            </a:graphic>
+          </wp:inline>
+        </w:drawing>
+      </w:r>
+    </w:p>
+    <w:p>
+      <w:pPr>
+        <w:spacing w:before="0" w:after="280"/>
+        <w:jc w:val="center"/>
+      </w:pPr>
+      <w:r>
+        <w:rPr>
+          <w:i/>
+          <w:color w:val="595959"/>
+          <w:sz w:val="18"/>
+        </w:rPr>
+        <w:t>Chegada da família real portuguesa ao Rio de Janeiro (1808)</w:t>
+      </w:r>
+    </w:p>
+    <w:p>
+      <w:pPr>
         <w:spacing w:after="200" w:line="336"/>
         <w:ind w:firstLine="360"/>
         <w:jc w:val="both"/>
@@ -220,6 +274,60 @@
     </w:p>
     <w:p>
       <w:pPr>
+        <w:spacing w:before="200" w:after="40"/>
+        <w:jc w:val="center"/>
+      </w:pPr>
+      <w:r>
+        <w:drawing>
+          <wp:inline xmlns:a="http://schemas.openxmlformats.org/drawingml/2006/main" xmlns:pic="http://schemas.openxmlformats.org/drawingml/2006/picture">
+            <wp:extent cx="4754880" cy="2544604"/>
+            <wp:docPr id="2" name="Picture 2"/>
+            <wp:cNvGraphicFramePr>
+              <a:graphicFrameLocks noChangeAspect="1"/>
+            </wp:cNvGraphicFramePr>
+            <a:graphic>
+              <a:graphicData uri="http://schemas.openxmlformats.org/drawingml/2006/picture">
+                <pic:pic>
+                  <pic:nvPicPr>
+                    <pic:cNvPr id="0" name="02.jpg"/>
+                    <pic:cNvPicPr/>
+                  </pic:nvPicPr>
+                  <pic:blipFill>
+                    <a:blip r:embed="rId11"/>
+                    <a:stretch>
+                      <a:fillRect/>
+                    </a:stretch>
+                  </pic:blipFill>
+                  <pic:spPr>
+                    <a:xfrm>
+                      <a:off x="0" y="0"/>
+                      <a:ext cx="4754880" cy="2544604"/>
+                    </a:xfrm>
+                    <a:prstGeom prst="rect"/>
+                  </pic:spPr>
+                </pic:pic>
+              </a:graphicData>
+            </a:graphic>
+          </wp:inline>
+        </w:drawing>
+      </w:r>
+    </w:p>
+    <w:p>
+      <w:pPr>
+        <w:spacing w:before="0" w:after="280"/>
+        <w:jc w:val="center"/>
+      </w:pPr>
+      <w:r>
+        <w:rPr>
+          <w:i/>
+          <w:color w:val="595959"/>
+          <w:sz w:val="18"/>
+        </w:rPr>
+        <w:t>Independência ou Morte — Pedro Américo (1888)</w:t>
+      </w:r>
+    </w:p>
+    <w:p>
+      <w:pPr>
         <w:spacing w:after="200" w:line="336"/>
         <w:ind w:firstLine="360"/>
         <w:jc w:val="both"/>
@@ -304,6 +412,60 @@
     </w:p>
     <w:p>
       <w:pPr>
+        <w:spacing w:before="200" w:after="40"/>
+        <w:jc w:val="center"/>
+      </w:pPr>
+      <w:r>
+        <w:drawing>
+          <wp:inline xmlns:a="http://schemas.openxmlformats.org/drawingml/2006/main" xmlns:pic="http://schemas.openxmlformats.org/drawingml/2006/picture">
+            <wp:extent cx="4754880" cy="5963748"/>
+            <wp:docPr id="3" name="Picture 3"/>
+            <wp:cNvGraphicFramePr>
+              <a:graphicFrameLocks noChangeAspect="1"/>
+            </wp:cNvGraphicFramePr>
+            <a:graphic>
+              <a:graphicData uri="http://schemas.openxmlformats.org/drawingml/2006/picture">
+                <pic:pic>
+                  <pic:nvPicPr>
+                    <pic:cNvPr id="0" name="03.jpg"/>
+                    <pic:cNvPicPr/>
+                  </pic:nvPicPr>
+                  <pic:blipFill>
+                    <a:blip r:embed="rId12"/>
+                    <a:stretch>
+                      <a:fillRect/>
+                    </a:stretch>
+                  </pic:blipFill>
+                  <pic:spPr>
+                    <a:xfrm>
+                      <a:off x="0" y="0"/>
+                      <a:ext cx="4754880" cy="5963748"/>
+                    </a:xfrm>
+                    <a:prstGeom prst="rect"/>
+                  </pic:spPr>
+                </pic:pic>
+              </a:graphicData>
+            </a:graphic>
+          </wp:inline>
+        </w:drawing>
+      </w:r>
+    </w:p>
+    <w:p>
+      <w:pPr>
+        <w:spacing w:before="0" w:after="280"/>
+        <w:jc w:val="center"/>
+      </w:pPr>
+      <w:r>
+        <w:rPr>
+          <w:i/>
+          <w:color w:val="595959"/>
+          <w:sz w:val="18"/>
+        </w:rPr>
+        <w:t>Dom Pedro I em trajes imperiais</w:t>
+      </w:r>
+    </w:p>
+    <w:p>
+      <w:pPr>
         <w:spacing w:after="200" w:line="336"/>
         <w:ind w:firstLine="360"/>
         <w:jc w:val="both"/>
@@ -343,6 +505,60 @@
     </w:p>
     <w:p>
       <w:pPr>
+        <w:spacing w:before="200" w:after="40"/>
+        <w:jc w:val="center"/>
+      </w:pPr>
+      <w:r>
+        <w:drawing>
+          <wp:inline xmlns:a="http://schemas.openxmlformats.org/drawingml/2006/main" xmlns:pic="http://schemas.openxmlformats.org/drawingml/2006/picture">
+            <wp:extent cx="4754880" cy="4906172"/>
+            <wp:docPr id="4" name="Picture 4"/>
+            <wp:cNvGraphicFramePr>
+              <a:graphicFrameLocks noChangeAspect="1"/>
+            </wp:cNvGraphicFramePr>
+            <a:graphic>
+              <a:graphicData uri="http://schemas.openxmlformats.org/drawingml/2006/picture">
+                <pic:pic>
+                  <pic:nvPicPr>
+                    <pic:cNvPr id="0" name="04.jpg"/>
+                    <pic:cNvPicPr/>
+                  </pic:nvPicPr>
+                  <pic:blipFill>
+                    <a:blip r:embed="rId13"/>
+                    <a:stretch>
+                      <a:fillRect/>
+                    </a:stretch>
+                  </pic:blipFill>
+                  <pic:spPr>
+                    <a:xfrm>
+                      <a:off x="0" y="0"/>
+                      <a:ext cx="4754880" cy="4906172"/>
+                    </a:xfrm>
+                    <a:prstGeom prst="rect"/>
+                  </pic:spPr>
+                </pic:pic>
+              </a:graphicData>
+            </a:graphic>
+          </wp:inline>
+        </w:drawing>
+      </w:r>
+    </w:p>
+    <w:p>
+      <w:pPr>
+        <w:spacing w:before="0" w:after="280"/>
+        <w:jc w:val="center"/>
+      </w:pPr>
+      <w:r>
+        <w:rPr>
+          <w:i/>
+          <w:color w:val="595959"/>
+          <w:sz w:val="18"/>
+        </w:rPr>
+        <w:t>Mapa da Revolução Farroupilha (1835–1845)</w:t>
+      </w:r>
+    </w:p>
+    <w:p>
+      <w:pPr>
         <w:spacing w:after="200" w:line="336"/>
         <w:ind w:firstLine="360"/>
         <w:jc w:val="both"/>
@@ -382,6 +598,60 @@
     </w:p>
     <w:p>
       <w:pPr>
+        <w:spacing w:before="200" w:after="40"/>
+        <w:jc w:val="center"/>
+      </w:pPr>
+      <w:r>
+        <w:drawing>
+          <wp:inline xmlns:a="http://schemas.openxmlformats.org/drawingml/2006/main" xmlns:pic="http://schemas.openxmlformats.org/drawingml/2006/picture">
+            <wp:extent cx="4754880" cy="7197548"/>
+            <wp:docPr id="5" name="Picture 5"/>
+            <wp:cNvGraphicFramePr>
+              <a:graphicFrameLocks noChangeAspect="1"/>
+            </wp:cNvGraphicFramePr>
+            <a:graphic>
+              <a:graphicData uri="http://schemas.openxmlformats.org/drawingml/2006/picture">
+                <pic:pic>
+                  <pic:nvPicPr>
+                    <pic:cNvPr id="0" name="05.jpg"/>
+                    <pic:cNvPicPr/>
+                  </pic:nvPicPr>
+                  <pic:blipFill>
+                    <a:blip r:embed="rId14"/>
+                    <a:stretch>
+                      <a:fillRect/>
+                    </a:stretch>
+                  </pic:blipFill>
+                  <pic:spPr>
+                    <a:xfrm>
+                      <a:off x="0" y="0"/>
+                      <a:ext cx="4754880" cy="7197548"/>
+                    </a:xfrm>
+                    <a:prstGeom prst="rect"/>
+                  </pic:spPr>
+                </pic:pic>
+              </a:graphicData>
+            </a:graphic>
+          </wp:inline>
+        </w:drawing>
+      </w:r>
+    </w:p>
+    <w:p>
+      <w:pPr>
+        <w:spacing w:before="0" w:after="280"/>
+        <w:jc w:val="center"/>
+      </w:pPr>
+      <w:r>
+        <w:rPr>
+          <w:i/>
+          <w:color w:val="595959"/>
+          <w:sz w:val="18"/>
+        </w:rPr>
+        <w:t>Dom Pedro II, circa 1887</w:t>
+      </w:r>
+    </w:p>
+    <w:p>
+      <w:pPr>
         <w:spacing w:after="200" w:line="336"/>
         <w:ind w:firstLine="360"/>
         <w:jc w:val="both"/>
@@ -451,6 +721,60 @@
     </w:p>
     <w:p>
       <w:pPr>
+        <w:spacing w:before="200" w:after="40"/>
+        <w:jc w:val="center"/>
+      </w:pPr>
+      <w:r>
+        <w:drawing>
+          <wp:inline xmlns:a="http://schemas.openxmlformats.org/drawingml/2006/main" xmlns:pic="http://schemas.openxmlformats.org/drawingml/2006/picture">
+            <wp:extent cx="4754880" cy="2927223"/>
+            <wp:docPr id="6" name="Picture 6"/>
+            <wp:cNvGraphicFramePr>
+              <a:graphicFrameLocks noChangeAspect="1"/>
+            </wp:cNvGraphicFramePr>
+            <a:graphic>
+              <a:graphicData uri="http://schemas.openxmlformats.org/drawingml/2006/picture">
+                <pic:pic>
+                  <pic:nvPicPr>
+                    <pic:cNvPr id="0" name="06.jpg"/>
+                    <pic:cNvPicPr/>
+                  </pic:nvPicPr>
+                  <pic:blipFill>
+                    <a:blip r:embed="rId15"/>
+                    <a:stretch>
+                      <a:fillRect/>
+                    </a:stretch>
+                  </pic:blipFill>
+                  <pic:spPr>
+                    <a:xfrm>
+                      <a:off x="0" y="0"/>
+                      <a:ext cx="4754880" cy="2927223"/>
+                    </a:xfrm>
+                    <a:prstGeom prst="rect"/>
+                  </pic:spPr>
+                </pic:pic>
+              </a:graphicData>
+            </a:graphic>
+          </wp:inline>
+        </w:drawing>
+      </w:r>
+    </w:p>
+    <w:p>
+      <w:pPr>
+        <w:spacing w:before="0" w:after="280"/>
+        <w:jc w:val="center"/>
+      </w:pPr>
+      <w:r>
+        <w:rPr>
+          <w:i/>
+          <w:color w:val="595959"/>
+          <w:sz w:val="18"/>
+        </w:rPr>
+        <w:t>Proclamação da República — Benedito Calixto</w:t>
+      </w:r>
+    </w:p>
+    <w:p>
+      <w:pPr>
         <w:spacing w:after="200" w:line="336"/>
         <w:ind w:firstLine="360"/>
         <w:jc w:val="both"/>
@@ -475,6 +799,60 @@
     </w:p>
     <w:p>
       <w:pPr>
+        <w:spacing w:before="200" w:after="40"/>
+        <w:jc w:val="center"/>
+      </w:pPr>
+      <w:r>
+        <w:drawing>
+          <wp:inline xmlns:a="http://schemas.openxmlformats.org/drawingml/2006/main" xmlns:pic="http://schemas.openxmlformats.org/drawingml/2006/picture">
+            <wp:extent cx="4754880" cy="3402711"/>
+            <wp:docPr id="7" name="Picture 7"/>
+            <wp:cNvGraphicFramePr>
+              <a:graphicFrameLocks noChangeAspect="1"/>
+            </wp:cNvGraphicFramePr>
+            <a:graphic>
+              <a:graphicData uri="http://schemas.openxmlformats.org/drawingml/2006/picture">
+                <pic:pic>
+                  <pic:nvPicPr>
+                    <pic:cNvPr id="0" name="07.jpg"/>
+                    <pic:cNvPicPr/>
+                  </pic:nvPicPr>
+                  <pic:blipFill>
+                    <a:blip r:embed="rId16"/>
+                    <a:stretch>
+                      <a:fillRect/>
+                    </a:stretch>
+                  </pic:blipFill>
+                  <pic:spPr>
+                    <a:xfrm>
+                      <a:off x="0" y="0"/>
+                      <a:ext cx="4754880" cy="3402711"/>
+                    </a:xfrm>
+                    <a:prstGeom prst="rect"/>
+                  </pic:spPr>
+                </pic:pic>
+              </a:graphicData>
+            </a:graphic>
+          </wp:inline>
+        </w:drawing>
+      </w:r>
+    </w:p>
+    <w:p>
+      <w:pPr>
+        <w:spacing w:before="0" w:after="280"/>
+        <w:jc w:val="center"/>
+      </w:pPr>
+      <w:r>
+        <w:rPr>
+          <w:i/>
+          <w:color w:val="595959"/>
+          <w:sz w:val="18"/>
+        </w:rPr>
+        <w:t>Fazenda de café em São Paulo, início do século XX</w:t>
+      </w:r>
+    </w:p>
+    <w:p>
+      <w:pPr>
         <w:spacing w:after="200" w:line="336"/>
         <w:ind w:firstLine="360"/>
         <w:jc w:val="both"/>
@@ -514,6 +892,60 @@
     </w:p>
     <w:p>
       <w:pPr>
+        <w:spacing w:before="200" w:after="40"/>
+        <w:jc w:val="center"/>
+      </w:pPr>
+      <w:r>
+        <w:drawing>
+          <wp:inline xmlns:a="http://schemas.openxmlformats.org/drawingml/2006/main" xmlns:pic="http://schemas.openxmlformats.org/drawingml/2006/picture">
+            <wp:extent cx="4754880" cy="7036123"/>
+            <wp:docPr id="8" name="Picture 8"/>
+            <wp:cNvGraphicFramePr>
+              <a:graphicFrameLocks noChangeAspect="1"/>
+            </wp:cNvGraphicFramePr>
+            <a:graphic>
+              <a:graphicData uri="http://schemas.openxmlformats.org/drawingml/2006/picture">
+                <pic:pic>
+                  <pic:nvPicPr>
+                    <pic:cNvPr id="0" name="08.jpg"/>
+                    <pic:cNvPicPr/>
+                  </pic:nvPicPr>
+                  <pic:blipFill>
+                    <a:blip r:embed="rId17"/>
+                    <a:stretch>
+                      <a:fillRect/>
+                    </a:stretch>
+                  </pic:blipFill>
+                  <pic:spPr>
+                    <a:xfrm>
+                      <a:off x="0" y="0"/>
+                      <a:ext cx="4754880" cy="7036123"/>
+                    </a:xfrm>
+                    <a:prstGeom prst="rect"/>
+                  </pic:spPr>
+                </pic:pic>
+              </a:graphicData>
+            </a:graphic>
+          </wp:inline>
+        </w:drawing>
+      </w:r>
+    </w:p>
+    <w:p>
+      <w:pPr>
+        <w:spacing w:before="0" w:after="280"/>
+        <w:jc w:val="center"/>
+      </w:pPr>
+      <w:r>
+        <w:rPr>
+          <w:i/>
+          <w:color w:val="595959"/>
+          <w:sz w:val="18"/>
+        </w:rPr>
+        <w:t>Getúlio Vargas (1930)</w:t>
+      </w:r>
+    </w:p>
+    <w:p>
+      <w:pPr>
         <w:spacing w:after="200" w:line="336"/>
         <w:ind w:firstLine="360"/>
         <w:jc w:val="both"/>
@@ -567,6 +999,60 @@
     </w:p>
     <w:p>
       <w:pPr>
+        <w:spacing w:before="200" w:after="40"/>
+        <w:jc w:val="center"/>
+      </w:pPr>
+      <w:r>
+        <w:drawing>
+          <wp:inline xmlns:a="http://schemas.openxmlformats.org/drawingml/2006/main" xmlns:pic="http://schemas.openxmlformats.org/drawingml/2006/picture">
+            <wp:extent cx="4754880" cy="3328416"/>
+            <wp:docPr id="9" name="Picture 9"/>
+            <wp:cNvGraphicFramePr>
+              <a:graphicFrameLocks noChangeAspect="1"/>
+            </wp:cNvGraphicFramePr>
+            <a:graphic>
+              <a:graphicData uri="http://schemas.openxmlformats.org/drawingml/2006/picture">
+                <pic:pic>
+                  <pic:nvPicPr>
+                    <pic:cNvPr id="0" name="01.jpg"/>
+                    <pic:cNvPicPr/>
+                  </pic:nvPicPr>
+                  <pic:blipFill>
+                    <a:blip r:embed="rId18"/>
+                    <a:stretch>
+                      <a:fillRect/>
+                    </a:stretch>
+                  </pic:blipFill>
+                  <pic:spPr>
+                    <a:xfrm>
+                      <a:off x="0" y="0"/>
+                      <a:ext cx="4754880" cy="3328416"/>
+                    </a:xfrm>
+                    <a:prstGeom prst="rect"/>
+                  </pic:spPr>
+                </pic:pic>
+              </a:graphicData>
+            </a:graphic>
+          </wp:inline>
+        </w:drawing>
+      </w:r>
+    </w:p>
+    <w:p>
+      <w:pPr>
+        <w:spacing w:before="0" w:after="280"/>
+        <w:jc w:val="center"/>
+      </w:pPr>
+      <w:r>
+        <w:rPr>
+          <w:i/>
+          <w:color w:val="595959"/>
+          <w:sz w:val="18"/>
+        </w:rPr>
+        <w:t>Getúlio Vargas em comício da Aliança Liberal (1930)</w:t>
+      </w:r>
+    </w:p>
+    <w:p>
+      <w:pPr>
         <w:spacing w:after="200" w:line="336"/>
         <w:ind w:firstLine="360"/>
         <w:jc w:val="both"/>
@@ -621,6 +1107,60 @@
     </w:p>
     <w:p>
       <w:pPr>
+        <w:spacing w:before="200" w:after="40"/>
+        <w:jc w:val="center"/>
+      </w:pPr>
+      <w:r>
+        <w:drawing>
+          <wp:inline xmlns:a="http://schemas.openxmlformats.org/drawingml/2006/main" xmlns:pic="http://schemas.openxmlformats.org/drawingml/2006/picture">
+            <wp:extent cx="4754880" cy="10308683"/>
+            <wp:docPr id="10" name="Picture 10"/>
+            <wp:cNvGraphicFramePr>
+              <a:graphicFrameLocks noChangeAspect="1"/>
+            </wp:cNvGraphicFramePr>
+            <a:graphic>
+              <a:graphicData uri="http://schemas.openxmlformats.org/drawingml/2006/picture">
+                <pic:pic>
+                  <pic:nvPicPr>
+                    <pic:cNvPr id="0" name="02.jpg"/>
+                    <pic:cNvPicPr/>
+                  </pic:nvPicPr>
+                  <pic:blipFill>
+                    <a:blip r:embed="rId19"/>
+                    <a:stretch>
+                      <a:fillRect/>
+                    </a:stretch>
+                  </pic:blipFill>
+                  <pic:spPr>
+                    <a:xfrm>
+                      <a:off x="0" y="0"/>
+                      <a:ext cx="4754880" cy="10308683"/>
+                    </a:xfrm>
+                    <a:prstGeom prst="rect"/>
+                  </pic:spPr>
+                </pic:pic>
+              </a:graphicData>
+            </a:graphic>
+          </wp:inline>
+        </w:drawing>
+      </w:r>
+    </w:p>
+    <w:p>
+      <w:pPr>
+        <w:spacing w:before="0" w:after="280"/>
+        <w:jc w:val="center"/>
+      </w:pPr>
+      <w:r>
+        <w:rPr>
+          <w:i/>
+          <w:color w:val="595959"/>
+          <w:sz w:val="18"/>
+        </w:rPr>
+        <w:t>Marcha integralista (1935)</w:t>
+      </w:r>
+    </w:p>
+    <w:p>
+      <w:pPr>
         <w:spacing w:after="200" w:line="336"/>
         <w:ind w:firstLine="360"/>
         <w:jc w:val="both"/>
@@ -632,6 +1172,60 @@
           <w:szCs w:val="22"/>
         </w:rPr>
         <w:t xml:space="preserve">Em 1937, o forjado "Plano Cohen" — obra do integralista Olímpio Mourão Filho, que décadas depois deflagraria o movimento de 1964 — serviu de pretexto para que Vargas cancelasse as eleições previstas, fechasse o Congresso, extinguisse os partidos e outorgasse a Constituição de 1937, de inspiração autoritária, instaurando o Estado Novo. A Ação Integralista, que apoiara a manobra esperando espaço de poder, sentiu-se traída e chegou a promover, em maio de 1938, um ataque armado ao Palácio Guanabara, repelido pelo próprio Vargas a tiros.</w:t>
+      </w:r>
+    </w:p>
+    <w:p>
+      <w:pPr>
+        <w:spacing w:before="200" w:after="40"/>
+        <w:jc w:val="center"/>
+      </w:pPr>
+      <w:r>
+        <w:drawing>
+          <wp:inline xmlns:a="http://schemas.openxmlformats.org/drawingml/2006/main" xmlns:pic="http://schemas.openxmlformats.org/drawingml/2006/picture">
+            <wp:extent cx="4754880" cy="7185321"/>
+            <wp:docPr id="11" name="Picture 11"/>
+            <wp:cNvGraphicFramePr>
+              <a:graphicFrameLocks noChangeAspect="1"/>
+            </wp:cNvGraphicFramePr>
+            <a:graphic>
+              <a:graphicData uri="http://schemas.openxmlformats.org/drawingml/2006/picture">
+                <pic:pic>
+                  <pic:nvPicPr>
+                    <pic:cNvPr id="0" name="03.jpg"/>
+                    <pic:cNvPicPr/>
+                  </pic:nvPicPr>
+                  <pic:blipFill>
+                    <a:blip r:embed="rId20"/>
+                    <a:stretch>
+                      <a:fillRect/>
+                    </a:stretch>
+                  </pic:blipFill>
+                  <pic:spPr>
+                    <a:xfrm>
+                      <a:off x="0" y="0"/>
+                      <a:ext cx="4754880" cy="7185321"/>
+                    </a:xfrm>
+                    <a:prstGeom prst="rect"/>
+                  </pic:spPr>
+                </pic:pic>
+              </a:graphicData>
+            </a:graphic>
+          </wp:inline>
+        </w:drawing>
+      </w:r>
+    </w:p>
+    <w:p>
+      <w:pPr>
+        <w:spacing w:before="0" w:after="280"/>
+        <w:jc w:val="center"/>
+      </w:pPr>
+      <w:r>
+        <w:rPr>
+          <w:i/>
+          <w:color w:val="595959"/>
+          <w:sz w:val="18"/>
+        </w:rPr>
+        <w:t>Propaganda do Estado Novo</w:t>
       </w:r>
     </w:p>
     <w:p>
@@ -705,6 +1299,60 @@
     </w:p>
     <w:p>
       <w:pPr>
+        <w:spacing w:before="200" w:after="40"/>
+        <w:jc w:val="center"/>
+      </w:pPr>
+      <w:r>
+        <w:drawing>
+          <wp:inline xmlns:a="http://schemas.openxmlformats.org/drawingml/2006/main" xmlns:pic="http://schemas.openxmlformats.org/drawingml/2006/picture">
+            <wp:extent cx="4754880" cy="7101804"/>
+            <wp:docPr id="12" name="Picture 12"/>
+            <wp:cNvGraphicFramePr>
+              <a:graphicFrameLocks noChangeAspect="1"/>
+            </wp:cNvGraphicFramePr>
+            <a:graphic>
+              <a:graphicData uri="http://schemas.openxmlformats.org/drawingml/2006/picture">
+                <pic:pic>
+                  <pic:nvPicPr>
+                    <pic:cNvPr id="0" name="04.jpg"/>
+                    <pic:cNvPicPr/>
+                  </pic:nvPicPr>
+                  <pic:blipFill>
+                    <a:blip r:embed="rId21"/>
+                    <a:stretch>
+                      <a:fillRect/>
+                    </a:stretch>
+                  </pic:blipFill>
+                  <pic:spPr>
+                    <a:xfrm>
+                      <a:off x="0" y="0"/>
+                      <a:ext cx="4754880" cy="7101804"/>
+                    </a:xfrm>
+                    <a:prstGeom prst="rect"/>
+                  </pic:spPr>
+                </pic:pic>
+              </a:graphicData>
+            </a:graphic>
+          </wp:inline>
+        </w:drawing>
+      </w:r>
+    </w:p>
+    <w:p>
+      <w:pPr>
+        <w:spacing w:before="0" w:after="280"/>
+        <w:jc w:val="center"/>
+      </w:pPr>
+      <w:r>
+        <w:rPr>
+          <w:i/>
+          <w:color w:val="595959"/>
+          <w:sz w:val="18"/>
+        </w:rPr>
+        <w:t>Eurico Gaspar Dutra</w:t>
+      </w:r>
+    </w:p>
+    <w:p>
+      <w:pPr>
         <w:spacing w:after="200" w:line="336"/>
         <w:ind w:firstLine="360"/>
         <w:jc w:val="both"/>
@@ -716,6 +1364,60 @@
           <w:szCs w:val="22"/>
         </w:rPr>
         <w:t xml:space="preserve">Vargas, que havia deixado montada, ainda em 1945, a estrutura partidária do PSD e do PTB, retornou ao poder pelo voto direto em 1950. Seu segundo governo criou a Petrobras (1953), sob o lema "o petróleo é nosso" — argumento contestado por quem defendia maior abertura ao capital estrangeiro, debate que ecoaria décadas depois, em sentido inverso, nas privatizações do governo Fernando Henrique Cardoso. A oposição, capitaneada por Carlos Lacerda através da Tribuna da Imprensa, intensificou-se até o atentado da Rua Tonelero, em agosto de 1954, que matou o major Rubens Vaz e feriu Lacerda, implicando o chefe da guarda pessoal de Vargas. Cercado por ultimato militar, Vargas suicidou-se no Palácio do Catete, em 24 de agosto de 1954, deixando uma carta-testamento cuja repercussão popular neutralizou, ao menos naquele momento, qualquer tentativa de golpe mais amplo.</w:t>
+      </w:r>
+    </w:p>
+    <w:p>
+      <w:pPr>
+        <w:spacing w:before="200" w:after="40"/>
+        <w:jc w:val="center"/>
+      </w:pPr>
+      <w:r>
+        <w:drawing>
+          <wp:inline xmlns:a="http://schemas.openxmlformats.org/drawingml/2006/main" xmlns:pic="http://schemas.openxmlformats.org/drawingml/2006/picture">
+            <wp:extent cx="4754880" cy="6335116"/>
+            <wp:docPr id="13" name="Picture 13"/>
+            <wp:cNvGraphicFramePr>
+              <a:graphicFrameLocks noChangeAspect="1"/>
+            </wp:cNvGraphicFramePr>
+            <a:graphic>
+              <a:graphicData uri="http://schemas.openxmlformats.org/drawingml/2006/picture">
+                <pic:pic>
+                  <pic:nvPicPr>
+                    <pic:cNvPr id="0" name="05.jpg"/>
+                    <pic:cNvPicPr/>
+                  </pic:nvPicPr>
+                  <pic:blipFill>
+                    <a:blip r:embed="rId22"/>
+                    <a:stretch>
+                      <a:fillRect/>
+                    </a:stretch>
+                  </pic:blipFill>
+                  <pic:spPr>
+                    <a:xfrm>
+                      <a:off x="0" y="0"/>
+                      <a:ext cx="4754880" cy="6335116"/>
+                    </a:xfrm>
+                    <a:prstGeom prst="rect"/>
+                  </pic:spPr>
+                </pic:pic>
+              </a:graphicData>
+            </a:graphic>
+          </wp:inline>
+        </w:drawing>
+      </w:r>
+    </w:p>
+    <w:p>
+      <w:pPr>
+        <w:spacing w:before="0" w:after="280"/>
+        <w:jc w:val="center"/>
+      </w:pPr>
+      <w:r>
+        <w:rPr>
+          <w:i/>
+          <w:color w:val="595959"/>
+          <w:sz w:val="18"/>
+        </w:rPr>
+        <w:t>Getúlio Vargas, segundo mandato (1951)</w:t>
       </w:r>
     </w:p>
     <w:p>
@@ -744,6 +1446,60 @@
     </w:p>
     <w:p>
       <w:pPr>
+        <w:spacing w:before="200" w:after="40"/>
+        <w:jc w:val="center"/>
+      </w:pPr>
+      <w:r>
+        <w:drawing>
+          <wp:inline xmlns:a="http://schemas.openxmlformats.org/drawingml/2006/main" xmlns:pic="http://schemas.openxmlformats.org/drawingml/2006/picture">
+            <wp:extent cx="4754880" cy="10308683"/>
+            <wp:docPr id="14" name="Picture 14"/>
+            <wp:cNvGraphicFramePr>
+              <a:graphicFrameLocks noChangeAspect="1"/>
+            </wp:cNvGraphicFramePr>
+            <a:graphic>
+              <a:graphicData uri="http://schemas.openxmlformats.org/drawingml/2006/picture">
+                <pic:pic>
+                  <pic:nvPicPr>
+                    <pic:cNvPr id="0" name="06.jpg"/>
+                    <pic:cNvPicPr/>
+                  </pic:nvPicPr>
+                  <pic:blipFill>
+                    <a:blip r:embed="rId23"/>
+                    <a:stretch>
+                      <a:fillRect/>
+                    </a:stretch>
+                  </pic:blipFill>
+                  <pic:spPr>
+                    <a:xfrm>
+                      <a:off x="0" y="0"/>
+                      <a:ext cx="4754880" cy="10308683"/>
+                    </a:xfrm>
+                    <a:prstGeom prst="rect"/>
+                  </pic:spPr>
+                </pic:pic>
+              </a:graphicData>
+            </a:graphic>
+          </wp:inline>
+        </w:drawing>
+      </w:r>
+    </w:p>
+    <w:p>
+      <w:pPr>
+        <w:spacing w:before="0" w:after="280"/>
+        <w:jc w:val="center"/>
+      </w:pPr>
+      <w:r>
+        <w:rPr>
+          <w:i/>
+          <w:color w:val="595959"/>
+          <w:sz w:val="18"/>
+        </w:rPr>
+        <w:t>Construção do Palácio da Alvorada, Brasília</w:t>
+      </w:r>
+    </w:p>
+    <w:p>
+      <w:pPr>
         <w:spacing w:after="200" w:line="336"/>
         <w:ind w:firstLine="360"/>
         <w:jc w:val="both"/>
@@ -755,6 +1511,60 @@
           <w:szCs w:val="22"/>
         </w:rPr>
         <w:t xml:space="preserve">Jânio Quadros, eleito em 1960, renunciou após apenas sete meses, em agosto de 1961, numa decisão cujos motivos os historiadores ainda debatem — se uma aposta política frustrada por poder ampliado, se pressão política e pessoal genuína. Como o vice João Goulart encontrava-se em viagem oficial à China comunista, ministros militares tentaram impedir sua posse; a Campanha da Legalidade, liderada pelo governador Leonel Brizola no Rio Grande do Sul, mobilizou apoio popular e militar suficiente para uma solução de compromisso: a instituição do parlamentarismo, em setembro de 1961, sob a qual Goulart tomou posse com poderes reduzidos. Tancredo Neves foi o primeiro-ministro nesse arranjo instável, que um plebiscito, em janeiro de 1963, encerrou, restabelecendo o presidencialismo pleno.</w:t>
+      </w:r>
+    </w:p>
+    <w:p>
+      <w:pPr>
+        <w:spacing w:before="200" w:after="40"/>
+        <w:jc w:val="center"/>
+      </w:pPr>
+      <w:r>
+        <w:drawing>
+          <wp:inline xmlns:a="http://schemas.openxmlformats.org/drawingml/2006/main" xmlns:pic="http://schemas.openxmlformats.org/drawingml/2006/picture">
+            <wp:extent cx="4754880" cy="6308823"/>
+            <wp:docPr id="15" name="Picture 15"/>
+            <wp:cNvGraphicFramePr>
+              <a:graphicFrameLocks noChangeAspect="1"/>
+            </wp:cNvGraphicFramePr>
+            <a:graphic>
+              <a:graphicData uri="http://schemas.openxmlformats.org/drawingml/2006/picture">
+                <pic:pic>
+                  <pic:nvPicPr>
+                    <pic:cNvPr id="0" name="07.jpg"/>
+                    <pic:cNvPicPr/>
+                  </pic:nvPicPr>
+                  <pic:blipFill>
+                    <a:blip r:embed="rId24"/>
+                    <a:stretch>
+                      <a:fillRect/>
+                    </a:stretch>
+                  </pic:blipFill>
+                  <pic:spPr>
+                    <a:xfrm>
+                      <a:off x="0" y="0"/>
+                      <a:ext cx="4754880" cy="6308823"/>
+                    </a:xfrm>
+                    <a:prstGeom prst="rect"/>
+                  </pic:spPr>
+                </pic:pic>
+              </a:graphicData>
+            </a:graphic>
+          </wp:inline>
+        </w:drawing>
+      </w:r>
+    </w:p>
+    <w:p>
+      <w:pPr>
+        <w:spacing w:before="0" w:after="280"/>
+        <w:jc w:val="center"/>
+      </w:pPr>
+      <w:r>
+        <w:rPr>
+          <w:i/>
+          <w:color w:val="595959"/>
+          <w:sz w:val="18"/>
+        </w:rPr>
+        <w:t>Jânio Quadros distribui vassourinhas em campanha (1960)</w:t>
       </w:r>
     </w:p>
     <w:p>
@@ -782,6 +1592,60 @@
       </w:r>
     </w:p>
     <w:p>
+      <w:pPr>
+        <w:spacing w:before="200" w:after="40"/>
+        <w:jc w:val="center"/>
+      </w:pPr>
+      <w:r>
+        <w:drawing>
+          <wp:inline xmlns:a="http://schemas.openxmlformats.org/drawingml/2006/main" xmlns:pic="http://schemas.openxmlformats.org/drawingml/2006/picture">
+            <wp:extent cx="4754880" cy="2812066"/>
+            <wp:docPr id="16" name="Picture 16"/>
+            <wp:cNvGraphicFramePr>
+              <a:graphicFrameLocks noChangeAspect="1"/>
+            </wp:cNvGraphicFramePr>
+            <a:graphic>
+              <a:graphicData uri="http://schemas.openxmlformats.org/drawingml/2006/picture">
+                <pic:pic>
+                  <pic:nvPicPr>
+                    <pic:cNvPr id="0" name="08.jpg"/>
+                    <pic:cNvPicPr/>
+                  </pic:nvPicPr>
+                  <pic:blipFill>
+                    <a:blip r:embed="rId25"/>
+                    <a:stretch>
+                      <a:fillRect/>
+                    </a:stretch>
+                  </pic:blipFill>
+                  <pic:spPr>
+                    <a:xfrm>
+                      <a:off x="0" y="0"/>
+                      <a:ext cx="4754880" cy="2812066"/>
+                    </a:xfrm>
+                    <a:prstGeom prst="rect"/>
+                  </pic:spPr>
+                </pic:pic>
+              </a:graphicData>
+            </a:graphic>
+          </wp:inline>
+        </w:drawing>
+      </w:r>
+    </w:p>
+    <w:p>
+      <w:pPr>
+        <w:spacing w:before="0" w:after="280"/>
+        <w:jc w:val="center"/>
+      </w:pPr>
+      <w:r>
+        <w:rPr>
+          <w:i/>
+          <w:color w:val="595959"/>
+          <w:sz w:val="18"/>
+        </w:rPr>
+        <w:t>Comício da Central do Brasil (13 de março de 1964)</w:t>
+      </w:r>
+    </w:p>
+    <w:p>
       <w:r>
         <w:br w:type="page"/>
       </w:r>
@@ -821,6 +1685,60 @@
     </w:p>
     <w:p>
       <w:pPr>
+        <w:spacing w:before="200" w:after="40"/>
+        <w:jc w:val="center"/>
+      </w:pPr>
+      <w:r>
+        <w:drawing>
+          <wp:inline xmlns:a="http://schemas.openxmlformats.org/drawingml/2006/main" xmlns:pic="http://schemas.openxmlformats.org/drawingml/2006/picture">
+            <wp:extent cx="4754880" cy="6043939"/>
+            <wp:docPr id="17" name="Picture 17"/>
+            <wp:cNvGraphicFramePr>
+              <a:graphicFrameLocks noChangeAspect="1"/>
+            </wp:cNvGraphicFramePr>
+            <a:graphic>
+              <a:graphicData uri="http://schemas.openxmlformats.org/drawingml/2006/picture">
+                <pic:pic>
+                  <pic:nvPicPr>
+                    <pic:cNvPr id="0" name="01.jpg"/>
+                    <pic:cNvPicPr/>
+                  </pic:nvPicPr>
+                  <pic:blipFill>
+                    <a:blip r:embed="rId26"/>
+                    <a:stretch>
+                      <a:fillRect/>
+                    </a:stretch>
+                  </pic:blipFill>
+                  <pic:spPr>
+                    <a:xfrm>
+                      <a:off x="0" y="0"/>
+                      <a:ext cx="4754880" cy="6043939"/>
+                    </a:xfrm>
+                    <a:prstGeom prst="rect"/>
+                  </pic:spPr>
+                </pic:pic>
+              </a:graphicData>
+            </a:graphic>
+          </wp:inline>
+        </w:drawing>
+      </w:r>
+    </w:p>
+    <w:p>
+      <w:pPr>
+        <w:spacing w:before="0" w:after="280"/>
+        <w:jc w:val="center"/>
+      </w:pPr>
+      <w:r>
+        <w:rPr>
+          <w:i/>
+          <w:color w:val="595959"/>
+          <w:sz w:val="18"/>
+        </w:rPr>
+        <w:t>João Goulart, 1964</w:t>
+      </w:r>
+    </w:p>
+    <w:p>
+      <w:pPr>
         <w:pStyle w:val="Heading2"/>
         <w:spacing w:after="150" w:before="300"/>
       </w:pPr>
@@ -869,6 +1787,60 @@
     </w:p>
     <w:p>
       <w:pPr>
+        <w:spacing w:before="200" w:after="40"/>
+        <w:jc w:val="center"/>
+      </w:pPr>
+      <w:r>
+        <w:drawing>
+          <wp:inline xmlns:a="http://schemas.openxmlformats.org/drawingml/2006/main" xmlns:pic="http://schemas.openxmlformats.org/drawingml/2006/picture">
+            <wp:extent cx="4754880" cy="6815021"/>
+            <wp:docPr id="18" name="Picture 18"/>
+            <wp:cNvGraphicFramePr>
+              <a:graphicFrameLocks noChangeAspect="1"/>
+            </wp:cNvGraphicFramePr>
+            <a:graphic>
+              <a:graphicData uri="http://schemas.openxmlformats.org/drawingml/2006/picture">
+                <pic:pic>
+                  <pic:nvPicPr>
+                    <pic:cNvPr id="0" name="02.jpg"/>
+                    <pic:cNvPicPr/>
+                  </pic:nvPicPr>
+                  <pic:blipFill>
+                    <a:blip r:embed="rId27"/>
+                    <a:stretch>
+                      <a:fillRect/>
+                    </a:stretch>
+                  </pic:blipFill>
+                  <pic:spPr>
+                    <a:xfrm>
+                      <a:off x="0" y="0"/>
+                      <a:ext cx="4754880" cy="6815021"/>
+                    </a:xfrm>
+                    <a:prstGeom prst="rect"/>
+                  </pic:spPr>
+                </pic:pic>
+              </a:graphicData>
+            </a:graphic>
+          </wp:inline>
+        </w:drawing>
+      </w:r>
+    </w:p>
+    <w:p>
+      <w:pPr>
+        <w:spacing w:before="0" w:after="280"/>
+        <w:jc w:val="center"/>
+      </w:pPr>
+      <w:r>
+        <w:rPr>
+          <w:i/>
+          <w:color w:val="595959"/>
+          <w:sz w:val="18"/>
+        </w:rPr>
+        <w:t>Ato Institucional nº 5 (1968)</w:t>
+      </w:r>
+    </w:p>
+    <w:p>
+      <w:pPr>
         <w:pStyle w:val="Heading2"/>
         <w:spacing w:after="150" w:before="300"/>
       </w:pPr>
@@ -908,6 +1880,60 @@
     </w:p>
     <w:p>
       <w:pPr>
+        <w:spacing w:before="200" w:after="40"/>
+        <w:jc w:val="center"/>
+      </w:pPr>
+      <w:r>
+        <w:drawing>
+          <wp:inline xmlns:a="http://schemas.openxmlformats.org/drawingml/2006/main" xmlns:pic="http://schemas.openxmlformats.org/drawingml/2006/picture">
+            <wp:extent cx="4754880" cy="5937801"/>
+            <wp:docPr id="19" name="Picture 19"/>
+            <wp:cNvGraphicFramePr>
+              <a:graphicFrameLocks noChangeAspect="1"/>
+            </wp:cNvGraphicFramePr>
+            <a:graphic>
+              <a:graphicData uri="http://schemas.openxmlformats.org/drawingml/2006/picture">
+                <pic:pic>
+                  <pic:nvPicPr>
+                    <pic:cNvPr id="0" name="03.jpg"/>
+                    <pic:cNvPicPr/>
+                  </pic:nvPicPr>
+                  <pic:blipFill>
+                    <a:blip r:embed="rId28"/>
+                    <a:stretch>
+                      <a:fillRect/>
+                    </a:stretch>
+                  </pic:blipFill>
+                  <pic:spPr>
+                    <a:xfrm>
+                      <a:off x="0" y="0"/>
+                      <a:ext cx="4754880" cy="5937801"/>
+                    </a:xfrm>
+                    <a:prstGeom prst="rect"/>
+                  </pic:spPr>
+                </pic:pic>
+              </a:graphicData>
+            </a:graphic>
+          </wp:inline>
+        </w:drawing>
+      </w:r>
+    </w:p>
+    <w:p>
+      <w:pPr>
+        <w:spacing w:before="0" w:after="280"/>
+        <w:jc w:val="center"/>
+      </w:pPr>
+      <w:r>
+        <w:rPr>
+          <w:i/>
+          <w:color w:val="595959"/>
+          <w:sz w:val="18"/>
+        </w:rPr>
+        <w:t>Vladimir Herzog</w:t>
+      </w:r>
+    </w:p>
+    <w:p>
+      <w:pPr>
         <w:spacing w:after="200" w:line="336"/>
         <w:ind w:firstLine="360"/>
         <w:jc w:val="both"/>
@@ -947,6 +1973,60 @@
     </w:p>
     <w:p>
       <w:pPr>
+        <w:spacing w:before="200" w:after="40"/>
+        <w:jc w:val="center"/>
+      </w:pPr>
+      <w:r>
+        <w:drawing>
+          <wp:inline xmlns:a="http://schemas.openxmlformats.org/drawingml/2006/main" xmlns:pic="http://schemas.openxmlformats.org/drawingml/2006/picture">
+            <wp:extent cx="4754880" cy="3208578"/>
+            <wp:docPr id="20" name="Picture 20"/>
+            <wp:cNvGraphicFramePr>
+              <a:graphicFrameLocks noChangeAspect="1"/>
+            </wp:cNvGraphicFramePr>
+            <a:graphic>
+              <a:graphicData uri="http://schemas.openxmlformats.org/drawingml/2006/picture">
+                <pic:pic>
+                  <pic:nvPicPr>
+                    <pic:cNvPr id="0" name="04.jpg"/>
+                    <pic:cNvPicPr/>
+                  </pic:nvPicPr>
+                  <pic:blipFill>
+                    <a:blip r:embed="rId29"/>
+                    <a:stretch>
+                      <a:fillRect/>
+                    </a:stretch>
+                  </pic:blipFill>
+                  <pic:spPr>
+                    <a:xfrm>
+                      <a:off x="0" y="0"/>
+                      <a:ext cx="4754880" cy="3208578"/>
+                    </a:xfrm>
+                    <a:prstGeom prst="rect"/>
+                  </pic:spPr>
+                </pic:pic>
+              </a:graphicData>
+            </a:graphic>
+          </wp:inline>
+        </w:drawing>
+      </w:r>
+    </w:p>
+    <w:p>
+      <w:pPr>
+        <w:spacing w:before="0" w:after="280"/>
+        <w:jc w:val="center"/>
+      </w:pPr>
+      <w:r>
+        <w:rPr>
+          <w:i/>
+          <w:color w:val="595959"/>
+          <w:sz w:val="18"/>
+        </w:rPr>
+        <w:t>Seleção brasileira tricampeã, Copa de 1970</w:t>
+      </w:r>
+    </w:p>
+    <w:p>
+      <w:pPr>
         <w:pStyle w:val="Heading2"/>
         <w:spacing w:after="150" w:before="300"/>
       </w:pPr>
@@ -971,6 +2051,60 @@
     </w:p>
     <w:p>
       <w:pPr>
+        <w:spacing w:before="200" w:after="40"/>
+        <w:jc w:val="center"/>
+      </w:pPr>
+      <w:r>
+        <w:drawing>
+          <wp:inline xmlns:a="http://schemas.openxmlformats.org/drawingml/2006/main" xmlns:pic="http://schemas.openxmlformats.org/drawingml/2006/picture">
+            <wp:extent cx="4754880" cy="7124094"/>
+            <wp:docPr id="21" name="Picture 21"/>
+            <wp:cNvGraphicFramePr>
+              <a:graphicFrameLocks noChangeAspect="1"/>
+            </wp:cNvGraphicFramePr>
+            <a:graphic>
+              <a:graphicData uri="http://schemas.openxmlformats.org/drawingml/2006/picture">
+                <pic:pic>
+                  <pic:nvPicPr>
+                    <pic:cNvPr id="0" name="05.jpg"/>
+                    <pic:cNvPicPr/>
+                  </pic:nvPicPr>
+                  <pic:blipFill>
+                    <a:blip r:embed="rId30"/>
+                    <a:stretch>
+                      <a:fillRect/>
+                    </a:stretch>
+                  </pic:blipFill>
+                  <pic:spPr>
+                    <a:xfrm>
+                      <a:off x="0" y="0"/>
+                      <a:ext cx="4754880" cy="7124094"/>
+                    </a:xfrm>
+                    <a:prstGeom prst="rect"/>
+                  </pic:spPr>
+                </pic:pic>
+              </a:graphicData>
+            </a:graphic>
+          </wp:inline>
+        </w:drawing>
+      </w:r>
+    </w:p>
+    <w:p>
+      <w:pPr>
+        <w:spacing w:before="0" w:after="280"/>
+        <w:jc w:val="center"/>
+      </w:pPr>
+      <w:r>
+        <w:rPr>
+          <w:i/>
+          <w:color w:val="595959"/>
+          <w:sz w:val="18"/>
+        </w:rPr>
+        <w:t>General Ernesto Geisel</w:t>
+      </w:r>
+    </w:p>
+    <w:p>
+      <w:pPr>
         <w:spacing w:after="200" w:line="336"/>
         <w:ind w:firstLine="360"/>
         <w:jc w:val="both"/>
@@ -1009,6 +2143,60 @@
       </w:r>
     </w:p>
     <w:p>
+      <w:pPr>
+        <w:spacing w:before="200" w:after="40"/>
+        <w:jc w:val="center"/>
+      </w:pPr>
+      <w:r>
+        <w:drawing>
+          <wp:inline xmlns:a="http://schemas.openxmlformats.org/drawingml/2006/main" xmlns:pic="http://schemas.openxmlformats.org/drawingml/2006/picture">
+            <wp:extent cx="4754880" cy="3169920"/>
+            <wp:docPr id="22" name="Picture 22"/>
+            <wp:cNvGraphicFramePr>
+              <a:graphicFrameLocks noChangeAspect="1"/>
+            </wp:cNvGraphicFramePr>
+            <a:graphic>
+              <a:graphicData uri="http://schemas.openxmlformats.org/drawingml/2006/picture">
+                <pic:pic>
+                  <pic:nvPicPr>
+                    <pic:cNvPr id="0" name="06.jpg"/>
+                    <pic:cNvPicPr/>
+                  </pic:nvPicPr>
+                  <pic:blipFill>
+                    <a:blip r:embed="rId31"/>
+                    <a:stretch>
+                      <a:fillRect/>
+                    </a:stretch>
+                  </pic:blipFill>
+                  <pic:spPr>
+                    <a:xfrm>
+                      <a:off x="0" y="0"/>
+                      <a:ext cx="4754880" cy="3169920"/>
+                    </a:xfrm>
+                    <a:prstGeom prst="rect"/>
+                  </pic:spPr>
+                </pic:pic>
+              </a:graphicData>
+            </a:graphic>
+          </wp:inline>
+        </w:drawing>
+      </w:r>
+    </w:p>
+    <w:p>
+      <w:pPr>
+        <w:spacing w:before="0" w:after="280"/>
+        <w:jc w:val="center"/>
+      </w:pPr>
+      <w:r>
+        <w:rPr>
+          <w:i/>
+          <w:color w:val="595959"/>
+          <w:sz w:val="18"/>
+        </w:rPr>
+        <w:t>Comício das Diretas Já (1984)</w:t>
+      </w:r>
+    </w:p>
+    <w:p>
       <w:r>
         <w:br w:type="page"/>
       </w:r>
@@ -1048,6 +2236,60 @@
     </w:p>
     <w:p>
       <w:pPr>
+        <w:spacing w:before="200" w:after="40"/>
+        <w:jc w:val="center"/>
+      </w:pPr>
+      <w:r>
+        <w:drawing>
+          <wp:inline xmlns:a="http://schemas.openxmlformats.org/drawingml/2006/main" xmlns:pic="http://schemas.openxmlformats.org/drawingml/2006/picture">
+            <wp:extent cx="4754880" cy="3173882"/>
+            <wp:docPr id="23" name="Picture 23"/>
+            <wp:cNvGraphicFramePr>
+              <a:graphicFrameLocks noChangeAspect="1"/>
+            </wp:cNvGraphicFramePr>
+            <a:graphic>
+              <a:graphicData uri="http://schemas.openxmlformats.org/drawingml/2006/picture">
+                <pic:pic>
+                  <pic:nvPicPr>
+                    <pic:cNvPr id="0" name="01.jpg"/>
+                    <pic:cNvPicPr/>
+                  </pic:nvPicPr>
+                  <pic:blipFill>
+                    <a:blip r:embed="rId32"/>
+                    <a:stretch>
+                      <a:fillRect/>
+                    </a:stretch>
+                  </pic:blipFill>
+                  <pic:spPr>
+                    <a:xfrm>
+                      <a:off x="0" y="0"/>
+                      <a:ext cx="4754880" cy="3173882"/>
+                    </a:xfrm>
+                    <a:prstGeom prst="rect"/>
+                  </pic:spPr>
+                </pic:pic>
+              </a:graphicData>
+            </a:graphic>
+          </wp:inline>
+        </w:drawing>
+      </w:r>
+    </w:p>
+    <w:p>
+      <w:pPr>
+        <w:spacing w:before="0" w:after="280"/>
+        <w:jc w:val="center"/>
+      </w:pPr>
+      <w:r>
+        <w:rPr>
+          <w:i/>
+          <w:color w:val="595959"/>
+          <w:sz w:val="18"/>
+        </w:rPr>
+        <w:t>Constituição de 1988</w:t>
+      </w:r>
+    </w:p>
+    <w:p>
+      <w:pPr>
         <w:pStyle w:val="Heading2"/>
         <w:spacing w:after="150" w:before="300"/>
       </w:pPr>
@@ -1072,6 +2314,60 @@
     </w:p>
     <w:p>
       <w:pPr>
+        <w:spacing w:before="200" w:after="40"/>
+        <w:jc w:val="center"/>
+      </w:pPr>
+      <w:r>
+        <w:drawing>
+          <wp:inline xmlns:a="http://schemas.openxmlformats.org/drawingml/2006/main" xmlns:pic="http://schemas.openxmlformats.org/drawingml/2006/picture">
+            <wp:extent cx="4754880" cy="3266564"/>
+            <wp:docPr id="24" name="Picture 24"/>
+            <wp:cNvGraphicFramePr>
+              <a:graphicFrameLocks noChangeAspect="1"/>
+            </wp:cNvGraphicFramePr>
+            <a:graphic>
+              <a:graphicData uri="http://schemas.openxmlformats.org/drawingml/2006/picture">
+                <pic:pic>
+                  <pic:nvPicPr>
+                    <pic:cNvPr id="0" name="02.jpg"/>
+                    <pic:cNvPicPr/>
+                  </pic:nvPicPr>
+                  <pic:blipFill>
+                    <a:blip r:embed="rId33"/>
+                    <a:stretch>
+                      <a:fillRect/>
+                    </a:stretch>
+                  </pic:blipFill>
+                  <pic:spPr>
+                    <a:xfrm>
+                      <a:off x="0" y="0"/>
+                      <a:ext cx="4754880" cy="3266564"/>
+                    </a:xfrm>
+                    <a:prstGeom prst="rect"/>
+                  </pic:spPr>
+                </pic:pic>
+              </a:graphicData>
+            </a:graphic>
+          </wp:inline>
+        </w:drawing>
+      </w:r>
+    </w:p>
+    <w:p>
+      <w:pPr>
+        <w:spacing w:before="0" w:after="280"/>
+        <w:jc w:val="center"/>
+      </w:pPr>
+      <w:r>
+        <w:rPr>
+          <w:i/>
+          <w:color w:val="595959"/>
+          <w:sz w:val="18"/>
+        </w:rPr>
+        <w:t>Movimento dos caras-pintadas (1992)</w:t>
+      </w:r>
+    </w:p>
+    <w:p>
+      <w:pPr>
         <w:pStyle w:val="Heading2"/>
         <w:spacing w:after="150" w:before="300"/>
       </w:pPr>
@@ -1135,6 +2431,60 @@
     </w:p>
     <w:p>
       <w:pPr>
+        <w:spacing w:before="200" w:after="40"/>
+        <w:jc w:val="center"/>
+      </w:pPr>
+      <w:r>
+        <w:drawing>
+          <wp:inline xmlns:a="http://schemas.openxmlformats.org/drawingml/2006/main" xmlns:pic="http://schemas.openxmlformats.org/drawingml/2006/picture">
+            <wp:extent cx="4754880" cy="6247082"/>
+            <wp:docPr id="25" name="Picture 25"/>
+            <wp:cNvGraphicFramePr>
+              <a:graphicFrameLocks noChangeAspect="1"/>
+            </wp:cNvGraphicFramePr>
+            <a:graphic>
+              <a:graphicData uri="http://schemas.openxmlformats.org/drawingml/2006/picture">
+                <pic:pic>
+                  <pic:nvPicPr>
+                    <pic:cNvPr id="0" name="03.jpg"/>
+                    <pic:cNvPicPr/>
+                  </pic:nvPicPr>
+                  <pic:blipFill>
+                    <a:blip r:embed="rId34"/>
+                    <a:stretch>
+                      <a:fillRect/>
+                    </a:stretch>
+                  </pic:blipFill>
+                  <pic:spPr>
+                    <a:xfrm>
+                      <a:off x="0" y="0"/>
+                      <a:ext cx="4754880" cy="6247082"/>
+                    </a:xfrm>
+                    <a:prstGeom prst="rect"/>
+                  </pic:spPr>
+                </pic:pic>
+              </a:graphicData>
+            </a:graphic>
+          </wp:inline>
+        </w:drawing>
+      </w:r>
+    </w:p>
+    <w:p>
+      <w:pPr>
+        <w:spacing w:before="0" w:after="280"/>
+        <w:jc w:val="center"/>
+      </w:pPr>
+      <w:r>
+        <w:rPr>
+          <w:i/>
+          <w:color w:val="595959"/>
+          <w:sz w:val="18"/>
+        </w:rPr>
+        <w:t>Lula, 2003</w:t>
+      </w:r>
+    </w:p>
+    <w:p>
+      <w:pPr>
         <w:spacing w:after="200" w:line="336"/>
         <w:ind w:firstLine="360"/>
         <w:jc w:val="both"/>
@@ -1174,6 +2524,60 @@
     </w:p>
     <w:p>
       <w:pPr>
+        <w:spacing w:before="200" w:after="40"/>
+        <w:jc w:val="center"/>
+      </w:pPr>
+      <w:r>
+        <w:drawing>
+          <wp:inline xmlns:a="http://schemas.openxmlformats.org/drawingml/2006/main" xmlns:pic="http://schemas.openxmlformats.org/drawingml/2006/picture">
+            <wp:extent cx="4754880" cy="3423998"/>
+            <wp:docPr id="26" name="Picture 26"/>
+            <wp:cNvGraphicFramePr>
+              <a:graphicFrameLocks noChangeAspect="1"/>
+            </wp:cNvGraphicFramePr>
+            <a:graphic>
+              <a:graphicData uri="http://schemas.openxmlformats.org/drawingml/2006/picture">
+                <pic:pic>
+                  <pic:nvPicPr>
+                    <pic:cNvPr id="0" name="04.jpg"/>
+                    <pic:cNvPicPr/>
+                  </pic:nvPicPr>
+                  <pic:blipFill>
+                    <a:blip r:embed="rId35"/>
+                    <a:stretch>
+                      <a:fillRect/>
+                    </a:stretch>
+                  </pic:blipFill>
+                  <pic:spPr>
+                    <a:xfrm>
+                      <a:off x="0" y="0"/>
+                      <a:ext cx="4754880" cy="3423998"/>
+                    </a:xfrm>
+                    <a:prstGeom prst="rect"/>
+                  </pic:spPr>
+                </pic:pic>
+              </a:graphicData>
+            </a:graphic>
+          </wp:inline>
+        </w:drawing>
+      </w:r>
+    </w:p>
+    <w:p>
+      <w:pPr>
+        <w:spacing w:before="0" w:after="280"/>
+        <w:jc w:val="center"/>
+      </w:pPr>
+      <w:r>
+        <w:rPr>
+          <w:i/>
+          <w:color w:val="595959"/>
+          <w:sz w:val="18"/>
+        </w:rPr>
+        <w:t>Jornadas de Junho (2013)</w:t>
+      </w:r>
+    </w:p>
+    <w:p>
+      <w:pPr>
         <w:spacing w:after="200" w:line="336"/>
         <w:ind w:firstLine="360"/>
         <w:jc w:val="both"/>
@@ -1227,6 +2631,60 @@
       </w:r>
     </w:p>
     <w:p>
+      <w:pPr>
+        <w:spacing w:before="200" w:after="40"/>
+        <w:jc w:val="center"/>
+      </w:pPr>
+      <w:r>
+        <w:drawing>
+          <wp:inline xmlns:a="http://schemas.openxmlformats.org/drawingml/2006/main" xmlns:pic="http://schemas.openxmlformats.org/drawingml/2006/picture">
+            <wp:extent cx="4754880" cy="3182806"/>
+            <wp:docPr id="27" name="Picture 27"/>
+            <wp:cNvGraphicFramePr>
+              <a:graphicFrameLocks noChangeAspect="1"/>
+            </wp:cNvGraphicFramePr>
+            <a:graphic>
+              <a:graphicData uri="http://schemas.openxmlformats.org/drawingml/2006/picture">
+                <pic:pic>
+                  <pic:nvPicPr>
+                    <pic:cNvPr id="0" name="05.jpg"/>
+                    <pic:cNvPicPr/>
+                  </pic:nvPicPr>
+                  <pic:blipFill>
+                    <a:blip r:embed="rId36"/>
+                    <a:stretch>
+                      <a:fillRect/>
+                    </a:stretch>
+                  </pic:blipFill>
+                  <pic:spPr>
+                    <a:xfrm>
+                      <a:off x="0" y="0"/>
+                      <a:ext cx="4754880" cy="3182806"/>
+                    </a:xfrm>
+                    <a:prstGeom prst="rect"/>
+                  </pic:spPr>
+                </pic:pic>
+              </a:graphicData>
+            </a:graphic>
+          </wp:inline>
+        </w:drawing>
+      </w:r>
+    </w:p>
+    <w:p>
+      <w:pPr>
+        <w:spacing w:before="0" w:after="280"/>
+        <w:jc w:val="center"/>
+      </w:pPr>
+      <w:r>
+        <w:rPr>
+          <w:i/>
+          <w:color w:val="595959"/>
+          <w:sz w:val="18"/>
+        </w:rPr>
+        <w:t>Michel Temer toma posse (31 de agosto de 2016)</w:t>
+      </w:r>
+    </w:p>
+    <w:p>
       <w:r>
         <w:br w:type="page"/>
       </w:r>
@@ -1266,6 +2724,60 @@
     </w:p>
     <w:p>
       <w:pPr>
+        <w:spacing w:before="200" w:after="40"/>
+        <w:jc w:val="center"/>
+      </w:pPr>
+      <w:r>
+        <w:drawing>
+          <wp:inline xmlns:a="http://schemas.openxmlformats.org/drawingml/2006/main" xmlns:pic="http://schemas.openxmlformats.org/drawingml/2006/picture">
+            <wp:extent cx="4754880" cy="7145206"/>
+            <wp:docPr id="28" name="Picture 28"/>
+            <wp:cNvGraphicFramePr>
+              <a:graphicFrameLocks noChangeAspect="1"/>
+            </wp:cNvGraphicFramePr>
+            <a:graphic>
+              <a:graphicData uri="http://schemas.openxmlformats.org/drawingml/2006/picture">
+                <pic:pic>
+                  <pic:nvPicPr>
+                    <pic:cNvPr id="0" name="01.jpg"/>
+                    <pic:cNvPicPr/>
+                  </pic:nvPicPr>
+                  <pic:blipFill>
+                    <a:blip r:embed="rId37"/>
+                    <a:stretch>
+                      <a:fillRect/>
+                    </a:stretch>
+                  </pic:blipFill>
+                  <pic:spPr>
+                    <a:xfrm>
+                      <a:off x="0" y="0"/>
+                      <a:ext cx="4754880" cy="7145206"/>
+                    </a:xfrm>
+                    <a:prstGeom prst="rect"/>
+                  </pic:spPr>
+                </pic:pic>
+              </a:graphicData>
+            </a:graphic>
+          </wp:inline>
+        </w:drawing>
+      </w:r>
+    </w:p>
+    <w:p>
+      <w:pPr>
+        <w:spacing w:before="0" w:after="280"/>
+        <w:jc w:val="center"/>
+      </w:pPr>
+      <w:r>
+        <w:rPr>
+          <w:i/>
+          <w:color w:val="595959"/>
+          <w:sz w:val="18"/>
+        </w:rPr>
+        <w:t>Michel Temer</w:t>
+      </w:r>
+    </w:p>
+    <w:p>
+      <w:pPr>
         <w:pStyle w:val="Heading2"/>
         <w:spacing w:after="150" w:before="300"/>
       </w:pPr>
@@ -1320,6 +2832,60 @@
     </w:p>
     <w:p>
       <w:pPr>
+        <w:spacing w:before="200" w:after="40"/>
+        <w:jc w:val="center"/>
+      </w:pPr>
+      <w:r>
+        <w:drawing>
+          <wp:inline xmlns:a="http://schemas.openxmlformats.org/drawingml/2006/main" xmlns:pic="http://schemas.openxmlformats.org/drawingml/2006/picture">
+            <wp:extent cx="4754880" cy="4729108"/>
+            <wp:docPr id="29" name="Picture 29"/>
+            <wp:cNvGraphicFramePr>
+              <a:graphicFrameLocks noChangeAspect="1"/>
+            </wp:cNvGraphicFramePr>
+            <a:graphic>
+              <a:graphicData uri="http://schemas.openxmlformats.org/drawingml/2006/picture">
+                <pic:pic>
+                  <pic:nvPicPr>
+                    <pic:cNvPr id="0" name="02.jpg"/>
+                    <pic:cNvPicPr/>
+                  </pic:nvPicPr>
+                  <pic:blipFill>
+                    <a:blip r:embed="rId38"/>
+                    <a:stretch>
+                      <a:fillRect/>
+                    </a:stretch>
+                  </pic:blipFill>
+                  <pic:spPr>
+                    <a:xfrm>
+                      <a:off x="0" y="0"/>
+                      <a:ext cx="4754880" cy="4729108"/>
+                    </a:xfrm>
+                    <a:prstGeom prst="rect"/>
+                  </pic:spPr>
+                </pic:pic>
+              </a:graphicData>
+            </a:graphic>
+          </wp:inline>
+        </w:drawing>
+      </w:r>
+    </w:p>
+    <w:p>
+      <w:pPr>
+        <w:spacing w:before="0" w:after="280"/>
+        <w:jc w:val="center"/>
+      </w:pPr>
+      <w:r>
+        <w:rPr>
+          <w:i/>
+          <w:color w:val="595959"/>
+          <w:sz w:val="18"/>
+        </w:rPr>
+        <w:t>Jair Bolsonaro é esfaqueado durante campanha (2018)</w:t>
+      </w:r>
+    </w:p>
+    <w:p>
+      <w:pPr>
         <w:pStyle w:val="Heading2"/>
         <w:spacing w:after="150" w:before="300"/>
       </w:pPr>
@@ -1344,6 +2910,60 @@
     </w:p>
     <w:p>
       <w:pPr>
+        <w:spacing w:before="200" w:after="40"/>
+        <w:jc w:val="center"/>
+      </w:pPr>
+      <w:r>
+        <w:drawing>
+          <wp:inline xmlns:a="http://schemas.openxmlformats.org/drawingml/2006/main" xmlns:pic="http://schemas.openxmlformats.org/drawingml/2006/picture">
+            <wp:extent cx="4754880" cy="6732859"/>
+            <wp:docPr id="30" name="Picture 30"/>
+            <wp:cNvGraphicFramePr>
+              <a:graphicFrameLocks noChangeAspect="1"/>
+            </wp:cNvGraphicFramePr>
+            <a:graphic>
+              <a:graphicData uri="http://schemas.openxmlformats.org/drawingml/2006/picture">
+                <pic:pic>
+                  <pic:nvPicPr>
+                    <pic:cNvPr id="0" name="03.jpg"/>
+                    <pic:cNvPicPr/>
+                  </pic:nvPicPr>
+                  <pic:blipFill>
+                    <a:blip r:embed="rId39"/>
+                    <a:stretch>
+                      <a:fillRect/>
+                    </a:stretch>
+                  </pic:blipFill>
+                  <pic:spPr>
+                    <a:xfrm>
+                      <a:off x="0" y="0"/>
+                      <a:ext cx="4754880" cy="6732859"/>
+                    </a:xfrm>
+                    <a:prstGeom prst="rect"/>
+                  </pic:spPr>
+                </pic:pic>
+              </a:graphicData>
+            </a:graphic>
+          </wp:inline>
+        </w:drawing>
+      </w:r>
+    </w:p>
+    <w:p>
+      <w:pPr>
+        <w:spacing w:before="0" w:after="280"/>
+        <w:jc w:val="center"/>
+      </w:pPr>
+      <w:r>
+        <w:rPr>
+          <w:i/>
+          <w:color w:val="595959"/>
+          <w:sz w:val="18"/>
+        </w:rPr>
+        <w:t>Jair Bolsonaro em ato de governo</w:t>
+      </w:r>
+    </w:p>
+    <w:p>
+      <w:pPr>
         <w:spacing w:after="200" w:line="336"/>
         <w:ind w:firstLine="360"/>
         <w:jc w:val="both"/>
@@ -1398,6 +3018,60 @@
     </w:p>
     <w:p>
       <w:pPr>
+        <w:spacing w:before="200" w:after="40"/>
+        <w:jc w:val="center"/>
+      </w:pPr>
+      <w:r>
+        <w:drawing>
+          <wp:inline xmlns:a="http://schemas.openxmlformats.org/drawingml/2006/main" xmlns:pic="http://schemas.openxmlformats.org/drawingml/2006/picture">
+            <wp:extent cx="4754880" cy="2506299"/>
+            <wp:docPr id="31" name="Picture 31"/>
+            <wp:cNvGraphicFramePr>
+              <a:graphicFrameLocks noChangeAspect="1"/>
+            </wp:cNvGraphicFramePr>
+            <a:graphic>
+              <a:graphicData uri="http://schemas.openxmlformats.org/drawingml/2006/picture">
+                <pic:pic>
+                  <pic:nvPicPr>
+                    <pic:cNvPr id="0" name="04.jpg"/>
+                    <pic:cNvPicPr/>
+                  </pic:nvPicPr>
+                  <pic:blipFill>
+                    <a:blip r:embed="rId40"/>
+                    <a:stretch>
+                      <a:fillRect/>
+                    </a:stretch>
+                  </pic:blipFill>
+                  <pic:spPr>
+                    <a:xfrm>
+                      <a:off x="0" y="0"/>
+                      <a:ext cx="4754880" cy="2506299"/>
+                    </a:xfrm>
+                    <a:prstGeom prst="rect"/>
+                  </pic:spPr>
+                </pic:pic>
+              </a:graphicData>
+            </a:graphic>
+          </wp:inline>
+        </w:drawing>
+      </w:r>
+    </w:p>
+    <w:p>
+      <w:pPr>
+        <w:spacing w:before="0" w:after="280"/>
+        <w:jc w:val="center"/>
+      </w:pPr>
+      <w:r>
+        <w:rPr>
+          <w:i/>
+          <w:color w:val="595959"/>
+          <w:sz w:val="18"/>
+        </w:rPr>
+        <w:t>Invasão do Congresso Nacional em 8 de janeiro de 2023</w:t>
+      </w:r>
+    </w:p>
+    <w:p>
+      <w:pPr>
         <w:pStyle w:val="Heading2"/>
         <w:spacing w:after="150" w:before="300"/>
       </w:pPr>
@@ -1461,6 +3135,60 @@
     </w:p>
     <w:p>
       <w:pPr>
+        <w:spacing w:before="200" w:after="40"/>
+        <w:jc w:val="center"/>
+      </w:pPr>
+      <w:r>
+        <w:drawing>
+          <wp:inline xmlns:a="http://schemas.openxmlformats.org/drawingml/2006/main" xmlns:pic="http://schemas.openxmlformats.org/drawingml/2006/picture">
+            <wp:extent cx="4754880" cy="6584671"/>
+            <wp:docPr id="32" name="Picture 32"/>
+            <wp:cNvGraphicFramePr>
+              <a:graphicFrameLocks noChangeAspect="1"/>
+            </wp:cNvGraphicFramePr>
+            <a:graphic>
+              <a:graphicData uri="http://schemas.openxmlformats.org/drawingml/2006/picture">
+                <pic:pic>
+                  <pic:nvPicPr>
+                    <pic:cNvPr id="0" name="05.jpg"/>
+                    <pic:cNvPicPr/>
+                  </pic:nvPicPr>
+                  <pic:blipFill>
+                    <a:blip r:embed="rId41"/>
+                    <a:stretch>
+                      <a:fillRect/>
+                    </a:stretch>
+                  </pic:blipFill>
+                  <pic:spPr>
+                    <a:xfrm>
+                      <a:off x="0" y="0"/>
+                      <a:ext cx="4754880" cy="6584671"/>
+                    </a:xfrm>
+                    <a:prstGeom prst="rect"/>
+                  </pic:spPr>
+                </pic:pic>
+              </a:graphicData>
+            </a:graphic>
+          </wp:inline>
+        </w:drawing>
+      </w:r>
+    </w:p>
+    <w:p>
+      <w:pPr>
+        <w:spacing w:before="0" w:after="280"/>
+        <w:jc w:val="center"/>
+      </w:pPr>
+      <w:r>
+        <w:rPr>
+          <w:i/>
+          <w:color w:val="595959"/>
+          <w:sz w:val="18"/>
+        </w:rPr>
+        <w:t>Eduardo Bolsonaro na CPAC (2022)</w:t>
+      </w:r>
+    </w:p>
+    <w:p>
+      <w:pPr>
         <w:pStyle w:val="Heading2"/>
         <w:spacing w:after="150" w:before="300"/>
       </w:pPr>
@@ -1481,6 +3209,60 @@
           <w:szCs w:val="22"/>
         </w:rPr>
         <w:t xml:space="preserve">Lula assumiu seu terceiro mandato em janeiro de 2023, dando sequência a programas sociais e enfrentando um Congresso fragmentado, com negociação intensa em torno de emendas parlamentares — o chamado "orçamento secreto" —, também questionado pelo Supremo. A eleição de 2026, com primeiro turno em 4 de outubro e eventual segundo turno em 25 de outubro, tem Lula, aos oitenta anos, buscando reeleição para um quarto mandato ao lado de Geraldo Alckmin. Com Jair Bolsonaro preso e inelegível, o senador Flávio Bolsonaro desponta como principal nome de oposição pelo PL, apresentando-se como herdeiro político do pai, ao lado de outros candidatos como os governadores Ronaldo Caiado e Romeu Zema.</w:t>
+      </w:r>
+    </w:p>
+    <w:p>
+      <w:pPr>
+        <w:spacing w:before="200" w:after="40"/>
+        <w:jc w:val="center"/>
+      </w:pPr>
+      <w:r>
+        <w:drawing>
+          <wp:inline xmlns:a="http://schemas.openxmlformats.org/drawingml/2006/main" xmlns:pic="http://schemas.openxmlformats.org/drawingml/2006/picture">
+            <wp:extent cx="4754880" cy="2370997"/>
+            <wp:docPr id="33" name="Picture 33"/>
+            <wp:cNvGraphicFramePr>
+              <a:graphicFrameLocks noChangeAspect="1"/>
+            </wp:cNvGraphicFramePr>
+            <a:graphic>
+              <a:graphicData uri="http://schemas.openxmlformats.org/drawingml/2006/picture">
+                <pic:pic>
+                  <pic:nvPicPr>
+                    <pic:cNvPr id="0" name="06.jpg"/>
+                    <pic:cNvPicPr/>
+                  </pic:nvPicPr>
+                  <pic:blipFill>
+                    <a:blip r:embed="rId42"/>
+                    <a:stretch>
+                      <a:fillRect/>
+                    </a:stretch>
+                  </pic:blipFill>
+                  <pic:spPr>
+                    <a:xfrm>
+                      <a:off x="0" y="0"/>
+                      <a:ext cx="4754880" cy="2370997"/>
+                    </a:xfrm>
+                    <a:prstGeom prst="rect"/>
+                  </pic:spPr>
+                </pic:pic>
+              </a:graphicData>
+            </a:graphic>
+          </wp:inline>
+        </w:drawing>
+      </w:r>
+    </w:p>
+    <w:p>
+      <w:pPr>
+        <w:spacing w:before="0" w:after="280"/>
+        <w:jc w:val="center"/>
+      </w:pPr>
+      <w:r>
+        <w:rPr>
+          <w:i/>
+          <w:color w:val="595959"/>
+          <w:sz w:val="18"/>
+        </w:rPr>
+        <w:t>Posse de Lula em Brasília (2023)</w:t>
       </w:r>
     </w:p>
     <w:p>

</xml_diff>

<commit_message>
add Banco Master / Vorcaro section to chapter 5
</commit_message>
<xml_diff>
--- a/livro-trajetoria-politica-brasileira.docx
+++ b/livro-trajetoria-politica-brasileira.docx
@@ -3185,6 +3185,38 @@
           <w:sz w:val="18"/>
         </w:rPr>
         <w:t>Eduardo Bolsonaro na CPAC (2022)</w:t>
+      </w:r>
+    </w:p>
+    <w:p>
+      <w:pPr>
+        <w:pStyle w:val="Heading2"/>
+      </w:pPr>
+      <w:r>
+        <w:t>O caso Banco Master e Daniel Vorcaro</w:t>
+      </w:r>
+    </w:p>
+    <w:p>
+      <w:pPr>
+        <w:ind w:firstLine="360"/>
+      </w:pPr>
+      <w:r>
+        <w:t>Em novembro de 2025, o banqueiro Daniel Vorcaro, controlador do Banco Master, foi preso por suspeita de fraude contra o sistema financeiro nacional, num rombo estimado em mais de R$ 47 bilhões, dos quais R$ 41 bilhões saíram do Fundo Garantidor de Créditos (FGC). Mensagens e documentos obtidos pela Polícia Federal, tornados públicos a partir de dezembro de 2025, revelaram que Vorcaro tratava como prioritários dois contratos: um patrocínio de cerca de R$ 131 milhões ao filme biográfico "Dark Horse", sobre o ex-presidente Jair Bolsonaro, negociado com o senador Flávio Bolsonaro — do qual ao menos R$ 61 milhões teriam sido pagos —; e um contrato de cerca de R$ 134 milhões com o escritório de advocacia de Viviane Barci de Moraes, esposa do ministro do STF Alexandre de Moraes, para atuar na defesa do próprio banco.</w:t>
+      </w:r>
+    </w:p>
+    <w:p>
+      <w:pPr>
+        <w:ind w:firstLine="360"/>
+      </w:pPr>
+      <w:r>
+        <w:t>Flávio Bolsonaro nega irregularidade, afirmando tratar-se de recurso privado, e responde a inquérito policial sobre o tema; em meio ao aumento da pressão pública, chegou a chamar Moraes publicamente de "laranja podre". Moraes não se pronunciou publicamente sobre o caso até o fechamento desta edição e não foi formalmente indiciado por nenhum crime relacionado; o ministro André Mendonça, relator do processo no STF, determinou que Moraes, o procurador-geral Paulo Gonet e o diretor-geral da Polícia Federal, Andrei Rodrigues, se manifestem formalmente sobre o assunto, e o Congresso instalou uma Comissão Parlamentar de Inquérito (CPI) para apurar o caso.</w:t>
+      </w:r>
+    </w:p>
+    <w:p>
+      <w:pPr>
+        <w:ind w:firstLine="360"/>
+      </w:pPr>
+      <w:r>
+        <w:t>Trata-se de investigação em curso, sem conclusão até o momento. Como nos demais casos em aberto deste capítulo, o texto registra aqui o fato apurado — valores, contratos, datas — sem antecipar responsabilização criminal, que cabe às instâncias competentes decidir.</w:t>
       </w:r>
     </w:p>
     <w:p>

</xml_diff>

<commit_message>
add Dilma Rousseff official portrait
</commit_message>
<xml_diff>
--- a/livro-trajetoria-politica-brasileira.docx
+++ b/livro-trajetoria-politica-brasileira.docx
@@ -2505,6 +2505,60 @@
       </w:pPr>
       <w:r>
         <w:t xml:space="preserve">Dilma, a Lava Jato e as Jornadas de Junho</w:t>
+      </w:r>
+    </w:p>
+    <w:p>
+      <w:pPr>
+        <w:spacing w:before="200" w:after="40"/>
+        <w:jc w:val="center"/>
+      </w:pPr>
+      <w:r>
+        <w:drawing>
+          <wp:inline xmlns:a="http://schemas.openxmlformats.org/drawingml/2006/main" xmlns:pic="http://schemas.openxmlformats.org/drawingml/2006/picture">
+            <wp:extent cx="3291840" cy="4937760"/>
+            <wp:docPr id="34" name="Picture 34"/>
+            <wp:cNvGraphicFramePr>
+              <a:graphicFrameLocks noChangeAspect="1"/>
+            </wp:cNvGraphicFramePr>
+            <a:graphic>
+              <a:graphicData uri="http://schemas.openxmlformats.org/drawingml/2006/picture">
+                <pic:pic>
+                  <pic:nvPicPr>
+                    <pic:cNvPr id="0" name="dilma.jpg"/>
+                    <pic:cNvPicPr/>
+                  </pic:nvPicPr>
+                  <pic:blipFill>
+                    <a:blip r:embed="rId43"/>
+                    <a:stretch>
+                      <a:fillRect/>
+                    </a:stretch>
+                  </pic:blipFill>
+                  <pic:spPr>
+                    <a:xfrm>
+                      <a:off x="0" y="0"/>
+                      <a:ext cx="3291840" cy="4937760"/>
+                    </a:xfrm>
+                    <a:prstGeom prst="rect"/>
+                  </pic:spPr>
+                </pic:pic>
+              </a:graphicData>
+            </a:graphic>
+          </wp:inline>
+        </w:drawing>
+      </w:r>
+    </w:p>
+    <w:p>
+      <w:pPr>
+        <w:spacing w:before="0" w:after="280"/>
+        <w:jc w:val="center"/>
+      </w:pPr>
+      <w:r>
+        <w:rPr>
+          <w:i/>
+          <w:color w:val="595959"/>
+          <w:sz w:val="18"/>
+        </w:rPr>
+        <w:t>Dilma Rousseff, primeira mulher a assumir a Presidência do Brasil (2011)</w:t>
       </w:r>
     </w:p>
     <w:p>

</xml_diff>